<commit_message>
Changed the current TEST_0 stego-files with random embedding locations to the ones used in the study
</commit_message>
<xml_diff>
--- a/data_set/TEST_0/stego_method_5_TEST_0.docx
+++ b/data_set/TEST_0/stego_method_5_TEST_0.docx
@@ -44,84 +44,78 @@
         <w:jc w:val="both"/>
       </w:pPr>
       <w:r>
+        <w:t xml:space="preserve">This difficulty of accurate recognition constitutes one of the most serious sources of friction in war, by making things appear entirely different from what one had expected. The senses make a more vivid impression on the mind than systematic thought-so much so that I doubt if a commander ever launched an operation of any magnitude without being forced to repress BOOK ONE new misgivings from the start. Ordinary men, who normally follow the initiative of others, tend to lose self-confidence when they reach the scene of action: things are not what they expected, the more so as they still let others influence them. But even the man who planned the operation and now sees it being carried out may well lose confidence in his </w:t>
+      </w:r>
+      <w:r>
+        <w:t>e</w:t>
+      </w:r>
+      <w:r>
+        <w:t xml:space="preserve">arlier </w:t>
+      </w:r>
+      <w:proofErr w:type="gramStart"/>
+      <w:r>
+        <w:t>judgment;</w:t>
+      </w:r>
+      <w:proofErr w:type="gramEnd"/>
+      <w:r>
+        <w:t xml:space="preserve"> whereas self-reliance is his best defence against the pressures of the moment. War has a way of masking the stage with scenery crudely daubed with fearsome apparitions. Once this is cleared away, and the horizon becomes unobstructed, developments will confirm his earlier convictions</w:t>
+      </w:r>
+      <w:r>
+        <w:t xml:space="preserve"> - </w:t>
+      </w:r>
+      <w:r>
+        <w:t>this is one of the great chasms between planning and execution.</w:t>
+      </w:r>
+    </w:p>
+    <w:p>
+      <w:pPr>
+        <w:jc w:val="both"/>
+      </w:pPr>
+      <w:r>
+        <w:br w:type="page"/>
+      </w:r>
+    </w:p>
+    <w:p>
+      <w:pPr>
+        <w:pStyle w:val="Title"/>
+        <w:jc w:val="both"/>
+      </w:pPr>
+      <w:r>
+        <w:lastRenderedPageBreak/>
+        <w:t>Cunning</w:t>
+      </w:r>
+    </w:p>
+    <w:p>
+      <w:pPr>
+        <w:jc w:val="both"/>
+      </w:pPr>
+      <w:r>
         <w:rPr>
           <w:noProof/>
         </w:rPr>
-        <w:t xml:space="preserve">This​​​difficulty   of ​ accurate ​ recognition   constitutes ​​one   of   the​  most  ​serious​​ sources​​​of   friction   in​ ​war,​  by ​​making   things  ​appear​  entirely​​​different ​ from ​​what  ​one​  had   expected.​  The​  senses​​​make ​​a​  more​​​vivid​  impression ​ on  ​the ​​mind  ​than​ ​systematic ​ thought-so ​ much  ​so​​ that​​​I   doubt ​​if​  a  ​commander  ​ever​ ​launched   an​  operation   of   any​​​magnitude   without   being   forced​​​to ​​repress ​ BOOK   ONE  ​new ​​misgivings   from   the​​​start. ​​Ordinary​  men,   who   normally   follow​​​the ​ initiative   of ​​others,   tend​​​to ​ lose ​​self-confidence​  when​​​they   reach  ​the  ​scene  ​of   action:   things   are   not​​​what ​​they​  expected,​  the​ ​more   so​​​as   they  ​still  ​let   others  ​influence​  them.​  But​​​even ​ the ​​man   who​  planned   the​ ​operation​  and​​​now  ​sees  ​it ​​being​​​carried   out   may   well   lose ​​confidence ​ in  ​his​​​</w:t>
-      </w:r>
-      <w:r>
-        <w:t>e</w:t>
-      </w:r>
+        <w:t xml:space="preserve">The​​​term   "cunning" ​ implies ​ secret   purpose. ​​It   contrasts   with​  the  ​straightforward,​​ simple,​​​direct   approach   much​ ​as​  wit ​​contrasts   with  ​direct​  proof.​​​Consequently, ​ it ​​has  ​nothing​  in   common​  with​  methods​​​of ​​persuasion,​  of​​​self-interest,​  or ​ of  ​force, ​​but  ​a​ ​great ​ deal ​ with  ​deceit,​​ which​​​also   conceals ​​its​  purpose.  ​It  ​is​ ​itself   a​  form   of   deceit,​​​when   it   is   completed;​​​yet ​​not ​ deceit   in  ​the ​​ordinary   sense   of​​​the ​​word,​  since   no   outright   breach​​​of ​ faith   is ​​involved.   The​​​use ​ of ​​a​  trick​​​or   stratagem  ​permits  ​the  ​intended   victim   to   make   his​​​own ​​mistakes,​  which,​  combined​ ​in   a​​​single   result,  ​suddenly  ​change   the  ​nature​  of​  the​​​situation ​ before ​​his   very​  eyes.   It​ ​might​  be​​​said,  ​that,  ​as ​​wit​​​juggles   with   ideas   and   beliefs, ​​so ​ cunning  ​juggles​​​with  ​actions.</w:t>
+      </w:r>
+    </w:p>
+    <w:p>
+      <w:pPr>
+        <w:jc w:val="both"/>
+      </w:pPr>
       <w:r>
         <w:rPr>
           <w:noProof/>
         </w:rPr>
-        <w:t xml:space="preserve">arlier  ​</w:t>
-      </w:r>
-      <w:proofErr w:type="gramStart"/>
-      <w:r>
-        <w:t>judgment;</w:t>
-      </w:r>
-      <w:proofErr w:type="gramEnd"/>
+        <w:t xml:space="preserve">At   first​​​glance,   it​​ seems ​ not ​​unjust  ​that   the​ ​term  ​"strategy"​  should​  be​​​derived   from   "cunning"   and  ​that,​  for ​​all   the ​ real​​​and​  apparent​ ​changes   that​  war​  has​​​undergone   since   the   days​​​of​  ancient   Greece, ​ this   term​  still   indicates   its  ​essential   nature.​​​</w:t>
+      </w:r>
+    </w:p>
+    <w:p>
+      <w:pPr>
+        <w:jc w:val="both"/>
+      </w:pPr>
       <w:r>
         <w:rPr>
           <w:noProof/>
         </w:rPr>
-        <w:t xml:space="preserve">   whereas​​​self-reliance   is​​ his ​ best ​​defence  ​against   the​ ​pressures  ​of​  the​  moment.​​​War   has   a   way  ​of​  masking ​​the   stage ​ with​​​scenery​  crudely​ ​daubed   with​  fearsome​  apparitions.​​​Once   this   is   cleared​​​away,​  and   the ​ horizon   becomes​  unobstructed,   developments   will  ​confirm   his​​​earlier  ​convictions</w:t>
-      </w:r>
-      <w:r>
-        <w:rPr>
-          <w:noProof/>
-        </w:rPr>
-        <w:t xml:space="preserve"> ​​-  ​</w:t>
-      </w:r>
-      <w:r>
-        <w:rPr>
-          <w:noProof/>
-        </w:rPr>
-        <w:t xml:space="preserve">this​  is​​​one of the great chasms between planning and execution.</w:t>
-      </w:r>
-    </w:p>
-    <w:p>
-      <w:pPr>
-        <w:jc w:val="both"/>
-      </w:pPr>
-      <w:r>
-        <w:br w:type="page"/>
-      </w:r>
-    </w:p>
-    <w:p>
-      <w:pPr>
-        <w:pStyle w:val="Title"/>
-        <w:jc w:val="both"/>
-      </w:pPr>
-      <w:r>
-        <w:lastRenderedPageBreak/>
-        <w:t>Cunning</w:t>
-      </w:r>
-    </w:p>
-    <w:p>
-      <w:pPr>
-        <w:jc w:val="both"/>
-      </w:pPr>
-      <w:r>
-        <w:t>The term "cunning" implies secret purpose. It contrasts with the straightforward, simple, direct approach much as wit contrasts with direct proof. Consequently, it has nothing in common with methods of persuasion, of self-interest, or of force, but a great deal with deceit, which also conceals its purpose. It is itself a form of deceit, when it is completed; yet not deceit in the ordinary sense of the word, since no outright breach of faith is involved. The use of a trick or stratagem permits the intended victim to make his own mistakes, which, combined in a single result, suddenly change the nature of the situation before his very eyes. It might be said, that, as wit juggles with ideas and beliefs, so cunning juggles with actions.</w:t>
-      </w:r>
-    </w:p>
-    <w:p>
-      <w:pPr>
-        <w:jc w:val="both"/>
-      </w:pPr>
-      <w:r>
-        <w:t xml:space="preserve">At first glance, it seems not unjust that the term "strategy" should be derived from "cunning" and that, for all the real and apparent changes that war has undergone since the days of ancient Greece, this term still indicates its essential nature. </w:t>
-      </w:r>
-    </w:p>
-    <w:p>
-      <w:pPr>
-        <w:jc w:val="both"/>
-      </w:pPr>
-      <w:r>
-        <w:t>If we leave the actual execution of force, the engagement, to tactics, and consider strategy as the art of skilfully exploiting force for a larger purpose, and if we disregard for the moment such characteristics as fierce ambition which acts like a compressed spring, great will-power which yields only reluctantly, etc., no human characteristic appears so suited to the task of directing and inspiring strategy as the gift of cunning. The universal urge to surprise, discussed in the previous chapter, already points to this conclusion: since each surprise action is rooted in at least some degree of cunning.</w:t>
+        <w:t xml:space="preserve">If  ​we ​​leave  ​the​  actual​​​execution of force, the engagement, to tactics, and consider strategy as the art of skilfully exploiting force for a larger purpose, and if we disregard for the moment such characteristics as fierce ambition which acts like a compressed spring, great will-power which yields only reluctantly, etc., no human characteristic appears so suited to the task of directing and inspiring strategy as the gift of cunning. The universal urge to surprise, discussed in the previous chapter, already points to this conclusion: since each surprise action is rooted in at least some degree of cunning.</w:t>
       </w:r>
     </w:p>
     <w:p>

</xml_diff>